<commit_message>
Hoàn thiện UI và bổ sung luồng demo đầy đủ
Áp dụng bản vá polish 5 vấn đề giao diện, sửa responsive sidebar trên mobile, giữ nguyên các API OCR, SePay và vé QR thật. Bổ sung tài khoản cùng dữ liệu demo xuyên suốt, công cụ reset/webhook và cập nhật tài liệu hướng dẫn cho thành viên.
</commit_message>
<xml_diff>
--- a/docs/UniBus_Huong_Dan_Demo_Luong_Chinh.docx
+++ b/docs/UniBus_Huong_Dan_Demo_Luong_Chinh.docx
@@ -502,7 +502,7 @@
                 <w:b w:val="0"/>
                 <w:sz w:val="20"/>
               </w:rPr>
-              <w:t>Database seed</w:t>
+              <w:t>Complete-flow seed</w:t>
             </w:r>
           </w:p>
         </w:tc>
@@ -522,7 +522,7 @@
                 <w:b w:val="0"/>
                 <w:sz w:val="20"/>
               </w:rPr>
-              <w:t>database/SeedStudentVerificationTestData.sql, SeedUniversitySubsidyDemo.sql, SeedUiV11MvpDemo.sql, SeedKhanhStudentUiTestData.sql</w:t>
+              <w:t>database/SeedCompleteDemoFlow.sql</w:t>
             </w:r>
           </w:p>
         </w:tc>
@@ -542,7 +542,69 @@
                 <w:b w:val="0"/>
                 <w:sz w:val="20"/>
               </w:rPr>
-              <w:t>Chi chay tren DB demo. Backup neu dung RDS chung.</w:t>
+              <w:t>Idempotent; chi reset giao dich cua SV-FLOW-001 va dua account ve trang thai san sang demo.</w:t>
+            </w:r>
+          </w:p>
+        </w:tc>
+      </w:tr>
+      <w:tr>
+        <w:tc>
+          <w:tcPr>
+            <w:tcW w:type="dxa" w:w="3120"/>
+            <w:vAlign w:val="center"/>
+          </w:tcPr>
+          <w:p>
+            <w:pPr>
+              <w:spacing w:after="0"/>
+            </w:pPr>
+            <w:r/>
+            <w:r>
+              <w:rPr>
+                <w:rFonts w:ascii="Calibri" w:hAnsi="Calibri"/>
+                <w:b w:val="0"/>
+                <w:sz w:val="20"/>
+              </w:rPr>
+              <w:t>Complete-flow reset</w:t>
+            </w:r>
+          </w:p>
+        </w:tc>
+        <w:tc>
+          <w:tcPr>
+            <w:tcW w:type="dxa" w:w="3120"/>
+            <w:vAlign w:val="center"/>
+          </w:tcPr>
+          <w:p>
+            <w:pPr>
+              <w:spacing w:after="0"/>
+            </w:pPr>
+            <w:r/>
+            <w:r>
+              <w:rPr>
+                <w:rFonts w:ascii="Calibri" w:hAnsi="Calibri"/>
+                <w:b w:val="0"/>
+                <w:sz w:val="20"/>
+              </w:rPr>
+              <w:t>database/ResetCompleteDemoFlow.sql</w:t>
+            </w:r>
+          </w:p>
+        </w:tc>
+        <w:tc>
+          <w:tcPr>
+            <w:tcW w:type="dxa" w:w="3120"/>
+            <w:vAlign w:val="center"/>
+          </w:tcPr>
+          <w:p>
+            <w:pPr>
+              <w:spacing w:after="0"/>
+            </w:pPr>
+            <w:r/>
+            <w:r>
+              <w:rPr>
+                <w:rFonts w:ascii="Calibri" w:hAnsi="Calibri"/>
+                <w:b w:val="0"/>
+                <w:sz w:val="20"/>
+              </w:rPr>
+              <w:t>Chi xoa dang ky/ve/payment/order cua SV-FLOW-001; khong drop DB va khong anh huong account khac.</w:t>
             </w:r>
           </w:p>
         </w:tc>
@@ -589,7 +651,7 @@
                 <w:color w:val="323232"/>
                 <w:sz w:val="20"/>
               </w:rPr>
-              <w:t>Khong drop database chi de demo UI. Neu can nap lai seed, hay backup/snapshot truoc va chay tung script seed theo thu tu. Cac seed trong database/ la du lieu demo, khong phai migration bat buoc.</w:t>
+              <w:t>Khong drop database chi de demo UI. RDS da o Flyway V13 va account complete-flow da duoc nap san. Seed/reset complete-flow chi tac dong du lieu giao dich cua SV-FLOW-001; cac seed cu khong nen chay lai hang loat tren RDS hien tai.</w:t>
             </w:r>
           </w:p>
         </w:tc>
@@ -832,6 +894,68 @@
                 <w:sz w:val="20"/>
               </w:rPr>
               <w:t>Roster, subsidy, stats, reconciliation, payment transactions.</w:t>
+            </w:r>
+          </w:p>
+        </w:tc>
+      </w:tr>
+      <w:tr>
+        <w:tc>
+          <w:tcPr>
+            <w:tcW w:type="dxa" w:w="3120"/>
+            <w:vAlign w:val="center"/>
+          </w:tcPr>
+          <w:p>
+            <w:pPr>
+              <w:spacing w:after="0"/>
+            </w:pPr>
+            <w:r/>
+            <w:r>
+              <w:rPr>
+                <w:rFonts w:ascii="Calibri" w:hAnsi="Calibri"/>
+                <w:b w:val="0"/>
+                <w:sz w:val="20"/>
+              </w:rPr>
+              <w:t>Student complete flow</w:t>
+            </w:r>
+          </w:p>
+        </w:tc>
+        <w:tc>
+          <w:tcPr>
+            <w:tcW w:type="dxa" w:w="3120"/>
+            <w:vAlign w:val="center"/>
+          </w:tcPr>
+          <w:p>
+            <w:pPr>
+              <w:spacing w:after="0"/>
+            </w:pPr>
+            <w:r/>
+            <w:r>
+              <w:rPr>
+                <w:rFonts w:ascii="Calibri" w:hAnsi="Calibri"/>
+                <w:b w:val="0"/>
+                <w:sz w:val="20"/>
+              </w:rPr>
+              <w:t>student.flow@unibus.local</w:t>
+            </w:r>
+          </w:p>
+        </w:tc>
+        <w:tc>
+          <w:tcPr>
+            <w:tcW w:type="dxa" w:w="3120"/>
+            <w:vAlign w:val="center"/>
+          </w:tcPr>
+          <w:p>
+            <w:pPr>
+              <w:spacing w:after="0"/>
+            </w:pPr>
+            <w:r/>
+            <w:r>
+              <w:rPr>
+                <w:rFonts w:ascii="Calibri" w:hAnsi="Calibri"/>
+                <w:b w:val="0"/>
+                <w:sz w:val="20"/>
+              </w:rPr>
+              <w:t>Mot account de demo dang ky tuyen, SePay, ve thang, hoa don va QR.</w:t>
             </w:r>
           </w:p>
         </w:tc>
@@ -1398,7 +1522,295 @@
           <w:rFonts w:ascii="Calibri" w:hAnsi="Calibri"/>
           <w:color w:val="2E74B5"/>
         </w:rPr>
-        <w:t>5. OCR sinh vien - chi tiet</w:t>
+        <w:t>5. Complete flow bang mot tai khoan</w:t>
+      </w:r>
+    </w:p>
+    <w:tbl>
+      <w:tblPr>
+        <w:tblStyle w:val="TableGrid"/>
+        <w:tblW w:type="auto" w:w="0"/>
+        <w:jc w:val="center"/>
+        <w:tblLook w:firstColumn="1" w:firstRow="1" w:lastColumn="0" w:lastRow="0" w:noHBand="0" w:noVBand="1" w:val="04A0"/>
+      </w:tblPr>
+      <w:tblGrid>
+        <w:gridCol w:w="9360"/>
+      </w:tblGrid>
+      <w:tr>
+        <w:tc>
+          <w:tcPr>
+            <w:tcW w:type="dxa" w:w="9360"/>
+            <w:shd w:fill="EAF4EA"/>
+          </w:tcPr>
+          <w:p>
+            <w:pPr>
+              <w:spacing w:after="80"/>
+            </w:pPr>
+            <w:r>
+              <w:rPr>
+                <w:rFonts w:ascii="Calibri" w:hAnsi="Calibri"/>
+                <w:b/>
+                <w:color w:val="14140F"/>
+                <w:sz w:val="21"/>
+              </w:rPr>
+              <w:t>Demo nhanh, khong can reset</w:t>
+            </w:r>
+          </w:p>
+          <w:p>
+            <w:pPr>
+              <w:spacing w:after="0"/>
+            </w:pPr>
+            <w:r>
+              <w:rPr>
+                <w:rFonts w:ascii="Calibri" w:hAnsi="Calibri"/>
+                <w:color w:val="323232"/>
+                <w:sz w:val="20"/>
+              </w:rPr>
+              <w:t>Dang nhap student.flow@unibus.local / Password123!. Account da VERIFIED, co dang ky tuyen 20, ve goc 50.000 VND, tro gia 12.500 VND, thanh toan 37.500 VND va QR UB-DEMO-FLOW-001. QR khop voi chuyen hom nay cua conductor.demo@unibus.local.</w:t>
+            </w:r>
+          </w:p>
+        </w:tc>
+      </w:tr>
+    </w:tbl>
+    <w:p/>
+    <w:p>
+      <w:pPr>
+        <w:pStyle w:val="ListNumber"/>
+        <w:spacing w:after="80"/>
+      </w:pPr>
+      <w:r>
+        <w:rPr>
+          <w:rFonts w:ascii="Calibri" w:hAnsi="Calibri"/>
+          <w:sz w:val="22"/>
+        </w:rPr>
+        <w:t>Dang nhap student.flow@unibus.local. Mo Truong cua toi de xac nhan trang thai VERIFIED va truong UniBus Demo University.</w:t>
+      </w:r>
+    </w:p>
+    <w:p>
+      <w:pPr>
+        <w:pStyle w:val="ListNumber"/>
+        <w:spacing w:after="80"/>
+      </w:pPr>
+      <w:r>
+        <w:rPr>
+          <w:rFonts w:ascii="Calibri" w:hAnsi="Calibri"/>
+          <w:sz w:val="22"/>
+        </w:rPr>
+        <w:t>Mo Tuyen cua toi/Ve cua toi de thay dang ky da APPROVED, ve thang ACTIVE, tien goc, tro gia va tien da tra.</w:t>
+      </w:r>
+    </w:p>
+    <w:p>
+      <w:pPr>
+        <w:pStyle w:val="ListNumber"/>
+        <w:spacing w:after="80"/>
+      </w:pPr>
+      <w:r>
+        <w:rPr>
+          <w:rFonts w:ascii="Calibri" w:hAnsi="Calibri"/>
+          <w:sz w:val="22"/>
+        </w:rPr>
+        <w:t>Mo Thanh toan/Hoa don de thay order Paid, payment PAID va hoa don tuong ung.</w:t>
+      </w:r>
+    </w:p>
+    <w:p>
+      <w:pPr>
+        <w:pStyle w:val="ListNumber"/>
+        <w:spacing w:after="80"/>
+      </w:pPr>
+      <w:r>
+        <w:rPr>
+          <w:rFonts w:ascii="Calibri" w:hAnsi="Calibri"/>
+          <w:sz w:val="22"/>
+        </w:rPr>
+        <w:t>Mo QR va giu man hinh QR UB-DEMO-FLOW-001.</w:t>
+      </w:r>
+    </w:p>
+    <w:p>
+      <w:pPr>
+        <w:pStyle w:val="ListNumber"/>
+        <w:spacing w:after="80"/>
+      </w:pPr>
+      <w:r>
+        <w:rPr>
+          <w:rFonts w:ascii="Calibri" w:hAnsi="Calibri"/>
+          <w:sz w:val="22"/>
+        </w:rPr>
+        <w:t>Dang xuat, dang nhap conductor.demo@unibus.local, chon chuyen hom nay va quet QR bang camera hoac nhap UB-DEMO-FLOW-001.</w:t>
+      </w:r>
+    </w:p>
+    <w:p>
+      <w:pPr>
+        <w:pStyle w:val="Heading1"/>
+        <w:keepNext/>
+      </w:pPr>
+      <w:r>
+        <w:rPr>
+          <w:rFonts w:ascii="Calibri" w:hAnsi="Calibri"/>
+          <w:color w:val="2E74B5"/>
+        </w:rPr>
+        <w:t>6. Complete flow live tu dau</w:t>
+      </w:r>
+    </w:p>
+    <w:p>
+      <w:pPr>
+        <w:spacing w:after="120"/>
+      </w:pPr>
+      <w:r>
+        <w:rPr>
+          <w:rFonts w:ascii="Calibri" w:hAnsi="Calibri"/>
+          <w:sz w:val="22"/>
+        </w:rPr>
+        <w:t>Chi dung cach nay khi muon thao tac truc tiep tu dang ky tuyen den thanh toan. Chay ResetCompleteDemoFlow.sql bang DB client tren RDS/demo DB; account van VERIFIED.</w:t>
+      </w:r>
+    </w:p>
+    <w:p>
+      <w:pPr>
+        <w:pStyle w:val="ListNumber"/>
+        <w:spacing w:after="80"/>
+      </w:pPr>
+      <w:r>
+        <w:rPr>
+          <w:rFonts w:ascii="Calibri" w:hAnsi="Calibri"/>
+          <w:sz w:val="22"/>
+        </w:rPr>
+        <w:t>Chay database/ResetCompleteDemoFlow.sql. Dang nhap student.flow@unibus.local / Password123!.</w:t>
+      </w:r>
+    </w:p>
+    <w:p>
+      <w:pPr>
+        <w:pStyle w:val="ListNumber"/>
+        <w:spacing w:after="80"/>
+      </w:pPr>
+      <w:r>
+        <w:rPr>
+          <w:rFonts w:ascii="Calibri" w:hAnsi="Calibri"/>
+          <w:sz w:val="22"/>
+        </w:rPr>
+        <w:t>Mo danh sach tuyen, chon tuyen duoc gan cho truong va dang ky diem len/xuong. Backend tao registration APPROVED.</w:t>
+      </w:r>
+    </w:p>
+    <w:p>
+      <w:pPr>
+        <w:pStyle w:val="ListNumber"/>
+        <w:spacing w:after="80"/>
+      </w:pPr>
+      <w:r>
+        <w:rPr>
+          <w:rFonts w:ascii="Calibri" w:hAnsi="Calibri"/>
+          <w:sz w:val="22"/>
+        </w:rPr>
+        <w:t>Chon mua ve thang, tao order SePay va ghi lai Order ID cung so tien chinh xac tren man hinh.</w:t>
+      </w:r>
+    </w:p>
+    <w:p>
+      <w:pPr>
+        <w:pStyle w:val="ListNumber"/>
+        <w:spacing w:after="80"/>
+      </w:pPr>
+      <w:r>
+        <w:rPr>
+          <w:rFonts w:ascii="Calibri" w:hAnsi="Calibri"/>
+          <w:sz w:val="22"/>
+        </w:rPr>
+        <w:t>Tai thu muc goc du an, chay: .\database\CompleteDemoSePayWebhook.ps1 -OrderId &lt;ORDER_ID&gt; -Amount &lt;SO_TIEN&gt;</w:t>
+      </w:r>
+    </w:p>
+    <w:p>
+      <w:pPr>
+        <w:pStyle w:val="ListNumber"/>
+        <w:spacing w:after="80"/>
+      </w:pPr>
+      <w:r>
+        <w:rPr>
+          <w:rFonts w:ascii="Calibri" w:hAnsi="Calibri"/>
+          <w:sz w:val="22"/>
+        </w:rPr>
+        <w:t>Frontend poll order status thanh Paid; mo Ve cua toi de thay ve thang va QR moi duoc backend cap.</w:t>
+      </w:r>
+    </w:p>
+    <w:p>
+      <w:pPr>
+        <w:pStyle w:val="ListNumber"/>
+        <w:spacing w:after="80"/>
+      </w:pPr>
+      <w:r>
+        <w:rPr>
+          <w:rFonts w:ascii="Calibri" w:hAnsi="Calibri"/>
+          <w:sz w:val="22"/>
+        </w:rPr>
+        <w:t>Dang nhap conductor.demo@unibus.local, chon chuyen cung tuyen va quet QR moi. Thu them INVALID-QR-001 de demo loi.</w:t>
+      </w:r>
+    </w:p>
+    <w:p>
+      <w:pPr>
+        <w:pStyle w:val="ListNumber"/>
+        <w:spacing w:after="80"/>
+      </w:pPr>
+      <w:r>
+        <w:rPr>
+          <w:rFonts w:ascii="Calibri" w:hAnsi="Calibri"/>
+          <w:sz w:val="22"/>
+        </w:rPr>
+        <w:t>Sau buoi demo, chay database/SeedCompleteDemoFlow.sql de dua RDS ve QR co dinh UB-DEMO-FLOW-001.</w:t>
+      </w:r>
+    </w:p>
+    <w:tbl>
+      <w:tblPr>
+        <w:tblStyle w:val="TableGrid"/>
+        <w:tblW w:type="auto" w:w="0"/>
+        <w:jc w:val="center"/>
+        <w:tblLook w:firstColumn="1" w:firstRow="1" w:lastColumn="0" w:lastRow="0" w:noHBand="0" w:noVBand="1" w:val="04A0"/>
+      </w:tblPr>
+      <w:tblGrid>
+        <w:gridCol w:w="9360"/>
+      </w:tblGrid>
+      <w:tr>
+        <w:tc>
+          <w:tcPr>
+            <w:tcW w:type="dxa" w:w="9360"/>
+            <w:shd w:fill="F4F6F9"/>
+          </w:tcPr>
+          <w:p>
+            <w:pPr>
+              <w:spacing w:after="80"/>
+            </w:pPr>
+            <w:r>
+              <w:rPr>
+                <w:rFonts w:ascii="Calibri" w:hAnsi="Calibri"/>
+                <w:b/>
+                <w:color w:val="14140F"/>
+                <w:sz w:val="21"/>
+              </w:rPr>
+              <w:t>Dieu kien cho webhook local</w:t>
+            </w:r>
+          </w:p>
+          <w:p>
+            <w:pPr>
+              <w:spacing w:after="0"/>
+            </w:pPr>
+            <w:r>
+              <w:rPr>
+                <w:rFonts w:ascii="Calibri" w:hAnsi="Calibri"/>
+                <w:color w:val="323232"/>
+                <w:sz w:val="20"/>
+              </w:rPr>
+              <w:t>Backend phai chay tai http://localhost:8080. Neu dung URL khac, them -BackendUrl https://host. Script gui payload SePay vao endpoint that /api/v1/payments/sepay/webhook, content DH&lt;OrderId&gt; va amount dung bang tong order.</w:t>
+            </w:r>
+          </w:p>
+        </w:tc>
+      </w:tr>
+    </w:tbl>
+    <w:p/>
+    <w:p>
+      <w:pPr>
+        <w:pStyle w:val="Heading1"/>
+        <w:keepNext/>
+      </w:pPr>
+      <w:r>
+        <w:rPr>
+          <w:rFonts w:ascii="Calibri" w:hAnsi="Calibri"/>
+          <w:color w:val="2E74B5"/>
+        </w:rPr>
+        <w:t>7. OCR sinh vien - chi tiet</w:t>
       </w:r>
     </w:p>
     <w:tbl>
@@ -1858,7 +2270,7 @@
           <w:rFonts w:ascii="Calibri" w:hAnsi="Calibri"/>
           <w:color w:val="2E74B5"/>
         </w:rPr>
-        <w:t>6. Scanner QR phu xe</w:t>
+        <w:t>8. Scanner QR phu xe</w:t>
       </w:r>
     </w:p>
     <w:p>
@@ -1872,6 +2284,19 @@
           <w:sz w:val="22"/>
         </w:rPr>
         <w:t>Scanner khong bi doi sang camera fake. Man phu xe van dung QrScannerModal va operationsApi.scanTicket.</w:t>
+      </w:r>
+    </w:p>
+    <w:p>
+      <w:pPr>
+        <w:pStyle w:val="ListBullet"/>
+        <w:spacing w:after="80"/>
+      </w:pPr>
+      <w:r>
+        <w:rPr>
+          <w:rFonts w:ascii="Calibri" w:hAnsi="Calibri"/>
+          <w:sz w:val="22"/>
+        </w:rPr>
+        <w:t>Complete flow: dung UB-DEMO-FLOW-001. QR nay duoc seed theo dung route cua chuyen hom nay gan cho conductor.demo.</w:t>
       </w:r>
     </w:p>
     <w:p>
@@ -1923,7 +2348,7 @@
           <w:rFonts w:ascii="Calibri" w:hAnsi="Calibri"/>
           <w:color w:val="2E74B5"/>
         </w:rPr>
-        <w:t>7. SePay va dashboard tien</w:t>
+        <w:t>9. SePay va dashboard tien</w:t>
       </w:r>
     </w:p>
     <w:p>
@@ -1975,7 +2400,7 @@
           <w:rFonts w:ascii="Calibri" w:hAnsi="Calibri"/>
           <w:sz w:val="22"/>
         </w:rPr>
-        <w:t>Neu muon demo webhook SePay that, can dung webhook key/cau hinh moi truong hien tai; khong can cho luong OCR.</w:t>
+        <w:t>CompleteDemoSePayWebhook.ps1 cho phep demo callback local co kiem soat; amount phai trung tong order va content phai chua DH&lt;OrderId&gt;.</w:t>
       </w:r>
     </w:p>
     <w:p>
@@ -1988,7 +2413,7 @@
           <w:rFonts w:ascii="Calibri" w:hAnsi="Calibri"/>
           <w:color w:val="2E74B5"/>
         </w:rPr>
-        <w:t>8. Phan UI da va khong thay doi tu patch v6</w:t>
+        <w:t>10. Phan UI da va khong thay doi tu patch v6</w:t>
       </w:r>
     </w:p>
     <w:tbl>
@@ -2458,7 +2883,7 @@
           <w:rFonts w:ascii="Calibri" w:hAnsi="Calibri"/>
           <w:color w:val="2E74B5"/>
         </w:rPr>
-        <w:t>9. Checklist truoc khi PR/demo</w:t>
+        <w:t>11. Checklist truoc khi PR/demo</w:t>
       </w:r>
     </w:p>
     <w:p>
@@ -2511,6 +2936,19 @@
           <w:sz w:val="22"/>
         </w:rPr>
         <w:t>Backend: mvn test pass.</w:t>
+      </w:r>
+    </w:p>
+    <w:p>
+      <w:pPr>
+        <w:pStyle w:val="ListBullet"/>
+        <w:spacing w:after="80"/>
+      </w:pPr>
+      <w:r>
+        <w:rPr>
+          <w:rFonts w:ascii="Calibri" w:hAnsi="Calibri"/>
+          <w:sz w:val="22"/>
+        </w:rPr>
+        <w:t>RDS: Flyway V13; student.flow co registration APPROVED, pass ACTIVE, payment/order Paid va QR UB-DEMO-FLOW-001.</w:t>
       </w:r>
     </w:p>
     <w:p>

</xml_diff>